<commit_message>
feat: Enhance consultation and submission processes
- Added npm retrieval in final Kartu document generation.
- Implemented eligibility check for consultation initiation in listMine endpoint.
- Created initFromApprovedPengajuan endpoint to handle outline initialization for students.
- Updated pengajuan disposisi pembimbing controller to rename mahasiswa_sks to sks_diperoleh.
- Introduced buildSuratPenyelesaianDocxBuffer function for generating completion letters.
- Enhanced getKaprodi endpoint to include additional data and regenerate completion letters.
- Updated template for pengajuan disposisi pembimbing with clearer requirements.
- Added comprehensive testing documentation for various system features including login, outline submission, and consultation processes.
</commit_message>
<xml_diff>
--- a/src/templates/template_formulir_pengajuan_disposisi_pembimbing_skripsi.docx
+++ b/src/templates/template_formulir_pengajuan_disposisi_pembimbing_skripsi.docx
@@ -787,6 +787,18 @@
               </w:rPr>
               <w:t>{{syarat_transkrip}}</w:t>
             </w:r>
+            <w:r>
+              <w:rPr>
+                <w:lang w:val="en-US"/>
+              </w:rPr>
+              <w:t xml:space="preserve"> </w:t>
+            </w:r>
+            <w:r>
+              <w:rPr>
+                <w:lang w:val="en-US"/>
+              </w:rPr>
+              <w:t>Salinan transkrip nilai</w:t>
+            </w:r>
           </w:p>
           <w:p>
             <w:pPr>
@@ -801,6 +813,18 @@
               </w:rPr>
               <w:t>{{syarat_krs}}</w:t>
             </w:r>
+            <w:r>
+              <w:rPr>
+                <w:lang w:val="en-US"/>
+              </w:rPr>
+              <w:t xml:space="preserve"> </w:t>
+            </w:r>
+            <w:r>
+              <w:rPr>
+                <w:lang w:val="en-US"/>
+              </w:rPr>
+              <w:t>Kartu Rencana Studi (KRS)</w:t>
+            </w:r>
           </w:p>
           <w:p>
             <w:pPr>
@@ -814,6 +838,18 @@
                 <w:lang w:val="en-US"/>
               </w:rPr>
               <w:t>{{syarat_metodologi}}</w:t>
+            </w:r>
+            <w:r>
+              <w:rPr>
+                <w:lang w:val="en-US"/>
+              </w:rPr>
+              <w:t xml:space="preserve"> </w:t>
+            </w:r>
+            <w:r>
+              <w:rPr>
+                <w:lang w:val="en-US"/>
+              </w:rPr>
+              <w:t>Lulus mata kuliah Metodologi Penelitian dengan nilai minimal C</w:t>
             </w:r>
           </w:p>
         </w:tc>
@@ -2059,7 +2095,6 @@
   <w:style w:type="character" w:default="1" w:styleId="DefaultParagraphFont">
     <w:name w:val="Default Paragraph Font"/>
     <w:uiPriority w:val="1"/>
-    <w:semiHidden/>
     <w:unhideWhenUsed/>
   </w:style>
   <w:style w:type="table" w:default="1" w:styleId="TableNormal">

</xml_diff>

<commit_message>
fix: Remove extra space in 'DISPOSISI KETUA PROGRAM STUDI' line in template
</commit_message>
<xml_diff>
--- a/src/templates/template_formulir_pengajuan_disposisi_pembimbing_skripsi.docx
+++ b/src/templates/template_formulir_pengajuan_disposisi_pembimbing_skripsi.docx
@@ -1040,16 +1040,6 @@
         <w:rPr>
           <w:b/>
           <w:bCs w:val="0"/>
-          <w:u w:val="single"/>
-          <w:lang w:val="en-US"/>
-        </w:rPr>
-        <w:t xml:space="preserve"> </w:t>
-      </w:r>
-      <w:r>
-        <w:rPr>
-          <w:b/>
-          <w:bCs w:val="0"/>
-          <w:color w:val="EE0000"/>
           <w:u w:val="single"/>
           <w:lang w:val="en-US"/>
         </w:rPr>
@@ -2095,6 +2085,7 @@
   <w:style w:type="character" w:default="1" w:styleId="DefaultParagraphFont">
     <w:name w:val="Default Paragraph Font"/>
     <w:uiPriority w:val="1"/>
+    <w:semiHidden/>
     <w:unhideWhenUsed/>
   </w:style>
   <w:style w:type="table" w:default="1" w:styleId="TableNormal">

</xml_diff>